<commit_message>
Further preparing for publication
</commit_message>
<xml_diff>
--- a/publication/metadata_templates/methods.docx
+++ b/publication/metadata_templates/methods.docx
@@ -129,7 +129,25 @@
           <w:sz w:val="21"/>
           <w:szCs w:val="21"/>
         </w:rPr>
-        <w:t>.0 (Bashevkin et al. 202</w:t>
+        <w:t>.</w:t>
+      </w:r>
+      <w:r>
+        <w:rPr>
+          <w:rFonts w:ascii="Helvetica" w:hAnsi="Helvetica" w:cs="Helvetica"/>
+          <w:color w:val="333333"/>
+          <w:sz w:val="21"/>
+          <w:szCs w:val="21"/>
+        </w:rPr>
+        <w:t>1</w:t>
+      </w:r>
+      <w:r>
+        <w:rPr>
+          <w:rFonts w:ascii="Helvetica" w:hAnsi="Helvetica" w:cs="Helvetica"/>
+          <w:color w:val="333333"/>
+          <w:sz w:val="21"/>
+          <w:szCs w:val="21"/>
+        </w:rPr>
+        <w:t xml:space="preserve"> (Bashevkin et al. 202</w:t>
       </w:r>
       <w:r>
         <w:rPr>
@@ -2982,7 +3000,16 @@
           <w:sz w:val="21"/>
           <w:szCs w:val="21"/>
         </w:rPr>
-        <w:t>.0</w:t>
+        <w:t>.</w:t>
+      </w:r>
+      <w:r>
+        <w:rPr>
+          <w:rFonts w:ascii="Helvetica" w:hAnsi="Helvetica" w:cs="Helvetica"/>
+          <w:color w:val="333333"/>
+          <w:sz w:val="21"/>
+          <w:szCs w:val="21"/>
+        </w:rPr>
+        <w:t>1</w:t>
       </w:r>
       <w:r>
         <w:rPr>
@@ -3020,7 +3047,7 @@
           <w:sz w:val="21"/>
           <w:szCs w:val="21"/>
         </w:rPr>
-        <w:t>10.5281/zenodo.22310579</w:t>
+        <w:t>10.5281/zenodo.22682061</w:t>
       </w:r>
     </w:p>
     <w:p>
@@ -3564,7 +3591,6 @@
   <w:style w:type="character" w:default="1" w:styleId="DefaultParagraphFont">
     <w:name w:val="Default Paragraph Font"/>
     <w:uiPriority w:val="1"/>
-    <w:semiHidden/>
     <w:unhideWhenUsed/>
   </w:style>
   <w:style w:type="table" w:default="1" w:styleId="TableNormal">

</xml_diff>